<commit_message>
docs: refine Sookta document framing
</commit_message>
<xml_diff>
--- a/docs/deliverables/sookta-2.1.0/Sookta_2.1.0_Application_Development_Workflow_Calculation_and_Guidelines_TH.docx
+++ b/docs/deliverables/sookta-2.1.0/Sookta_2.1.0_Application_Development_Workflow_Calculation_and_Guidelines_TH.docx
@@ -356,45 +356,6 @@
           </w:p>
         </w:tc>
       </w:tr>
-      <w:tr>
-        <w:trPr>
-          <w:cantSplit/>
-        </w:trPr>
-        <w:tc>
-          <w:tcPr>
-            <w:tcW w:type="dxa" w:w="4513"/>
-            <w:vAlign w:val="center"/>
-          </w:tcPr>
-          <w:p>
-            <w:pPr>
-              <w:spacing w:after="40"/>
-            </w:pPr>
-            <w:r>
-              <w:rPr>
-                <w:rFonts w:ascii="Sarabun" w:hAnsi="Sarabun" w:eastAsia="Sarabun" w:cs="Sarabun"/>
-              </w:rPr>
-              <w:t>กลุ่มผู้อ่าน</w:t>
-            </w:r>
-          </w:p>
-        </w:tc>
-        <w:tc>
-          <w:tcPr>
-            <w:tcW w:type="dxa" w:w="4513"/>
-            <w:vAlign w:val="center"/>
-          </w:tcPr>
-          <w:p>
-            <w:pPr>
-              <w:spacing w:after="40"/>
-            </w:pPr>
-            <w:r>
-              <w:rPr>
-                <w:rFonts w:ascii="Sarabun" w:hAnsi="Sarabun" w:eastAsia="Sarabun" w:cs="Sarabun"/>
-              </w:rPr>
-              <w:t>คณะวิจัย อาจารย์ ทีมพัฒนา และผู้ดูแลระบบ</w:t>
-            </w:r>
-          </w:p>
-        </w:tc>
-      </w:tr>
     </w:tbl>
     <w:p>
       <w:pPr>
@@ -439,7 +400,7 @@
         <w:rPr>
           <w:rFonts w:ascii="Sarabun" w:hAnsi="Sarabun" w:eastAsia="Sarabun" w:cs="Sarabun"/>
         </w:rPr>
-        <w:t>บทสรุปผู้บริหาร</w:t>
+        <w:t>สรุปภาพรวม</w:t>
       </w:r>
     </w:p>
     <w:p>
@@ -485,7 +446,7 @@
         <w:rPr>
           <w:rFonts w:ascii="Sarabun" w:hAnsi="Sarabun" w:eastAsia="Sarabun" w:cs="Sarabun"/>
         </w:rPr>
-        <w:t>เอกสารมีวัตถุประสงค์เพื่อทำให้คณะวิจัยและทีมพัฒนาเข้าใจระบบจากหลักฐาน ชุดเดียวกัน โดยอธิบายสิ่งที่ผู้ใช้เห็นควบคู่กับวิธีที่ application ประมวลผล ข้อมูลภายใน</w:t>
+        <w:t>เอกสารมีวัตถุประสงค์เพื่ออธิบายระบบจากหลักฐานชุดเดียวกัน โดยเชื่อมโยง สิ่งที่ผู้ใช้เห็นกับวิธีที่ application ประมวลผลข้อมูลภายใน และทำให้ ตรวจสอบย้อนกลับถึง source code, test และแหล่งอ้างอิงได้</w:t>
       </w:r>
     </w:p>
     <w:p>

</xml_diff>